<commit_message>
Clean up analytics: remove debug logs, fix migration schema
Remove console.log debug statements from analytics.ts. Update
migration SQL to use text instead of uuid FK for campaign_id to
prevent silent insert failures from foreign key constraint.
Also includes PRD v3 update with cost estimates section (7.8).

Co-Authored-By: Claude Opus 4.6 (1M context) <noreply@anthropic.com>
</commit_message>
<xml_diff>
--- a/creative-studio/SkratchAds_Creative_Studio_PRD_v3.docx
+++ b/creative-studio/SkratchAds_Creative_Studio_PRD_v3.docx
@@ -6358,6 +6358,644 @@
           <w:szCs w:val="22"/>
         </w:rPr>
         <w:t xml:space="preserve">When Gemini Pro Image or higher-fidelity models become available, swap the model string in the API route. The prompt architecture is model-agnostic.</w:t>
+      </w:r>
+    </w:p>
+    <w:p>
+      <w:pPr>
+        <w:pStyle w:val="Heading2"/>
+        <w:spacing w:after="180" w:before="360"/>
+      </w:pPr>
+      <w:r>
+        <w:rPr>
+          <w:rFonts w:ascii="Arial" w:cs="Arial" w:eastAsia="Arial" w:hAnsi="Arial"/>
+          <w:b/>
+          <w:bCs/>
+          <w:sz w:val="28"/>
+          <w:szCs w:val="28"/>
+        </w:rPr>
+        <w:t xml:space="preserve">7.8 AI Generation Cost Estimates</w:t>
+      </w:r>
+    </w:p>
+    <w:p>
+      <w:pPr>
+        <w:spacing w:after="120" w:before="120"/>
+      </w:pPr>
+      <w:r>
+        <w:rPr>
+          <w:rFonts w:ascii="Arial" w:cs="Arial" w:eastAsia="Arial" w:hAnsi="Arial"/>
+          <w:sz w:val="22"/>
+          <w:szCs w:val="22"/>
+        </w:rPr>
+        <w:t xml:space="preserve">Each AI-generated banner image incurs a per-call cost via the Google Gemini API. The estimates below reflect current pricing as of March 2026 and may change as Google updates its model tiers.</w:t>
+      </w:r>
+    </w:p>
+    <w:p>
+      <w:pPr>
+        <w:spacing w:after="60" w:before="180"/>
+      </w:pPr>
+      <w:r>
+        <w:rPr>
+          <w:rFonts w:ascii="Arial" w:cs="Arial" w:eastAsia="Arial" w:hAnsi="Arial"/>
+          <w:b/>
+          <w:bCs/>
+          <w:sz w:val="22"/>
+          <w:szCs w:val="22"/>
+        </w:rPr>
+        <w:t xml:space="preserve">Per-Image Cost by Model</w:t>
+      </w:r>
+    </w:p>
+    <w:tbl>
+      <w:tblPr>
+        <w:tblW w:type="dxa" w:w="9360"/>
+        <w:tblBorders>
+          <w:top w:color="CCCCCC" w:sz="4" w:val="single" w:space="0"/>
+          <w:left w:color="CCCCCC" w:sz="4" w:val="single" w:space="0"/>
+          <w:bottom w:color="CCCCCC" w:sz="4" w:val="single" w:space="0"/>
+          <w:right w:color="CCCCCC" w:sz="4" w:val="single" w:space="0"/>
+          <w:insideH w:color="CCCCCC" w:sz="4" w:val="single" w:space="0"/>
+          <w:insideV w:color="CCCCCC" w:sz="4" w:val="single" w:space="0"/>
+        </w:tblBorders>
+      </w:tblPr>
+      <w:tblGrid>
+        <w:gridCol w:w="4680"/>
+        <w:gridCol w:w="4680"/>
+      </w:tblGrid>
+      <w:tr>
+        <w:tc>
+          <w:tcPr>
+            <w:tcW w:type="dxa" w:w="4680"/>
+            <w:shd w:fill="D5E8F0" w:val="clear"/>
+            <w:tcMar>
+              <w:top w:type="dxa" w:w="80"/>
+              <w:left w:type="dxa" w:w="120"/>
+              <w:bottom w:type="dxa" w:w="80"/>
+              <w:right w:type="dxa" w:w="120"/>
+            </w:tcMar>
+          </w:tcPr>
+          <w:p>
+            <w:r>
+              <w:rPr>
+                <w:rFonts w:ascii="Arial" w:hAnsi="Arial"/>
+                <w:b/>
+                <w:sz w:val="22"/>
+              </w:rPr>
+              <w:t>Model</w:t>
+            </w:r>
+          </w:p>
+        </w:tc>
+        <w:tc>
+          <w:tcPr>
+            <w:tcW w:type="dxa" w:w="4680"/>
+            <w:shd w:fill="D5E8F0" w:val="clear"/>
+            <w:tcMar>
+              <w:top w:type="dxa" w:w="80"/>
+              <w:left w:type="dxa" w:w="120"/>
+              <w:bottom w:type="dxa" w:w="80"/>
+              <w:right w:type="dxa" w:w="120"/>
+            </w:tcMar>
+          </w:tcPr>
+          <w:p>
+            <w:r>
+              <w:rPr>
+                <w:rFonts w:ascii="Arial" w:hAnsi="Arial"/>
+                <w:b/>
+                <w:sz w:val="22"/>
+              </w:rPr>
+              <w:t>Estimated Cost per Image</w:t>
+            </w:r>
+          </w:p>
+        </w:tc>
+      </w:tr>
+      <w:tr>
+        <w:tc>
+          <w:tcPr>
+            <w:tcW w:type="dxa" w:w="4680"/>
+            <w:tcMar>
+              <w:top w:type="dxa" w:w="80"/>
+              <w:left w:type="dxa" w:w="120"/>
+              <w:bottom w:type="dxa" w:w="80"/>
+              <w:right w:type="dxa" w:w="120"/>
+            </w:tcMar>
+          </w:tcPr>
+          <w:p>
+            <w:r>
+              <w:rPr>
+                <w:rFonts w:ascii="Arial" w:hAnsi="Arial"/>
+                <w:sz w:val="22"/>
+              </w:rPr>
+              <w:t>Gemini 2.5 Flash (current)</w:t>
+            </w:r>
+          </w:p>
+        </w:tc>
+        <w:tc>
+          <w:tcPr>
+            <w:tcW w:type="dxa" w:w="4680"/>
+            <w:tcMar>
+              <w:top w:type="dxa" w:w="80"/>
+              <w:left w:type="dxa" w:w="120"/>
+              <w:bottom w:type="dxa" w:w="80"/>
+              <w:right w:type="dxa" w:w="120"/>
+            </w:tcMar>
+          </w:tcPr>
+          <w:p>
+            <w:r>
+              <w:rPr>
+                <w:rFonts w:ascii="Arial" w:hAnsi="Arial"/>
+                <w:sz w:val="22"/>
+              </w:rPr>
+              <w:t>$0.02 - $0.05</w:t>
+            </w:r>
+          </w:p>
+        </w:tc>
+      </w:tr>
+      <w:tr>
+        <w:tc>
+          <w:tcPr>
+            <w:tcW w:type="dxa" w:w="4680"/>
+            <w:tcMar>
+              <w:top w:type="dxa" w:w="80"/>
+              <w:left w:type="dxa" w:w="120"/>
+              <w:bottom w:type="dxa" w:w="80"/>
+              <w:right w:type="dxa" w:w="120"/>
+            </w:tcMar>
+          </w:tcPr>
+          <w:p>
+            <w:r>
+              <w:rPr>
+                <w:rFonts w:ascii="Arial" w:hAnsi="Arial"/>
+                <w:sz w:val="22"/>
+              </w:rPr>
+              <w:t>Gemini 3 Pro (future upgrade)</w:t>
+            </w:r>
+          </w:p>
+        </w:tc>
+        <w:tc>
+          <w:tcPr>
+            <w:tcW w:type="dxa" w:w="4680"/>
+            <w:tcMar>
+              <w:top w:type="dxa" w:w="80"/>
+              <w:left w:type="dxa" w:w="120"/>
+              <w:bottom w:type="dxa" w:w="80"/>
+              <w:right w:type="dxa" w:w="120"/>
+            </w:tcMar>
+          </w:tcPr>
+          <w:p>
+            <w:r>
+              <w:rPr>
+                <w:rFonts w:ascii="Arial" w:hAnsi="Arial"/>
+                <w:sz w:val="22"/>
+              </w:rPr>
+              <w:t>$0.05 - $0.10</w:t>
+            </w:r>
+          </w:p>
+        </w:tc>
+      </w:tr>
+    </w:tbl>
+    <w:p>
+      <w:pPr>
+        <w:spacing w:after="60" w:before="240"/>
+      </w:pPr>
+      <w:r>
+        <w:rPr>
+          <w:rFonts w:ascii="Arial" w:cs="Arial" w:eastAsia="Arial" w:hAnsi="Arial"/>
+          <w:b/>
+          <w:bCs/>
+          <w:sz w:val="22"/>
+          <w:szCs w:val="22"/>
+        </w:rPr>
+        <w:t xml:space="preserve">Campaign-Level Cost Scenarios (Gemini 2.5 Flash)</w:t>
+      </w:r>
+    </w:p>
+    <w:tbl>
+      <w:tblPr>
+        <w:tblW w:type="dxa" w:w="9360"/>
+        <w:tblBorders>
+          <w:top w:color="CCCCCC" w:sz="4" w:val="single" w:space="0"/>
+          <w:left w:color="CCCCCC" w:sz="4" w:val="single" w:space="0"/>
+          <w:bottom w:color="CCCCCC" w:sz="4" w:val="single" w:space="0"/>
+          <w:right w:color="CCCCCC" w:sz="4" w:val="single" w:space="0"/>
+          <w:insideH w:color="CCCCCC" w:sz="4" w:val="single" w:space="0"/>
+          <w:insideV w:color="CCCCCC" w:sz="4" w:val="single" w:space="0"/>
+        </w:tblBorders>
+      </w:tblPr>
+      <w:tblGrid>
+        <w:gridCol w:w="3120"/>
+        <w:gridCol w:w="3120"/>
+        <w:gridCol w:w="3120"/>
+      </w:tblGrid>
+      <w:tr>
+        <w:tc>
+          <w:tcPr>
+            <w:tcW w:type="dxa" w:w="3120"/>
+            <w:shd w:fill="D5E8F0" w:val="clear"/>
+            <w:tcMar>
+              <w:top w:type="dxa" w:w="80"/>
+              <w:left w:type="dxa" w:w="120"/>
+              <w:bottom w:type="dxa" w:w="80"/>
+              <w:right w:type="dxa" w:w="120"/>
+            </w:tcMar>
+          </w:tcPr>
+          <w:p>
+            <w:r>
+              <w:rPr>
+                <w:rFonts w:ascii="Arial" w:hAnsi="Arial"/>
+                <w:b/>
+                <w:sz w:val="22"/>
+              </w:rPr>
+              <w:t>Scenario</w:t>
+            </w:r>
+          </w:p>
+        </w:tc>
+        <w:tc>
+          <w:tcPr>
+            <w:tcW w:type="dxa" w:w="3120"/>
+            <w:shd w:fill="D5E8F0" w:val="clear"/>
+            <w:tcMar>
+              <w:top w:type="dxa" w:w="80"/>
+              <w:left w:type="dxa" w:w="120"/>
+              <w:bottom w:type="dxa" w:w="80"/>
+              <w:right w:type="dxa" w:w="120"/>
+            </w:tcMar>
+          </w:tcPr>
+          <w:p>
+            <w:r>
+              <w:rPr>
+                <w:rFonts w:ascii="Arial" w:hAnsi="Arial"/>
+                <w:b/>
+                <w:sz w:val="22"/>
+              </w:rPr>
+              <w:t>Images Generated</w:t>
+            </w:r>
+          </w:p>
+        </w:tc>
+        <w:tc>
+          <w:tcPr>
+            <w:tcW w:type="dxa" w:w="3120"/>
+            <w:shd w:fill="D5E8F0" w:val="clear"/>
+            <w:tcMar>
+              <w:top w:type="dxa" w:w="80"/>
+              <w:left w:type="dxa" w:w="120"/>
+              <w:bottom w:type="dxa" w:w="80"/>
+              <w:right w:type="dxa" w:w="120"/>
+            </w:tcMar>
+          </w:tcPr>
+          <w:p>
+            <w:r>
+              <w:rPr>
+                <w:rFonts w:ascii="Arial" w:hAnsi="Arial"/>
+                <w:b/>
+                <w:sz w:val="22"/>
+              </w:rPr>
+              <w:t>Estimated Cost</w:t>
+            </w:r>
+          </w:p>
+        </w:tc>
+      </w:tr>
+      <w:tr>
+        <w:tc>
+          <w:tcPr>
+            <w:tcW w:type="dxa" w:w="3120"/>
+            <w:tcMar>
+              <w:top w:type="dxa" w:w="80"/>
+              <w:left w:type="dxa" w:w="120"/>
+              <w:bottom w:type="dxa" w:w="80"/>
+              <w:right w:type="dxa" w:w="120"/>
+            </w:tcMar>
+          </w:tcPr>
+          <w:p>
+            <w:r>
+              <w:rPr>
+                <w:rFonts w:ascii="Arial" w:hAnsi="Arial"/>
+                <w:sz w:val="22"/>
+              </w:rPr>
+              <w:t>Single format, all 5 states</w:t>
+            </w:r>
+          </w:p>
+        </w:tc>
+        <w:tc>
+          <w:tcPr>
+            <w:tcW w:type="dxa" w:w="3120"/>
+            <w:tcMar>
+              <w:top w:type="dxa" w:w="80"/>
+              <w:left w:type="dxa" w:w="120"/>
+              <w:bottom w:type="dxa" w:w="80"/>
+              <w:right w:type="dxa" w:w="120"/>
+            </w:tcMar>
+          </w:tcPr>
+          <w:p>
+            <w:r>
+              <w:rPr>
+                <w:rFonts w:ascii="Arial" w:hAnsi="Arial"/>
+                <w:sz w:val="22"/>
+              </w:rPr>
+              <w:t>5</w:t>
+            </w:r>
+          </w:p>
+        </w:tc>
+        <w:tc>
+          <w:tcPr>
+            <w:tcW w:type="dxa" w:w="3120"/>
+            <w:tcMar>
+              <w:top w:type="dxa" w:w="80"/>
+              <w:left w:type="dxa" w:w="120"/>
+              <w:bottom w:type="dxa" w:w="80"/>
+              <w:right w:type="dxa" w:w="120"/>
+            </w:tcMar>
+          </w:tcPr>
+          <w:p>
+            <w:r>
+              <w:rPr>
+                <w:rFonts w:ascii="Arial" w:hAnsi="Arial"/>
+                <w:sz w:val="22"/>
+              </w:rPr>
+              <w:t>$0.10 - $0.25</w:t>
+            </w:r>
+          </w:p>
+        </w:tc>
+      </w:tr>
+      <w:tr>
+        <w:tc>
+          <w:tcPr>
+            <w:tcW w:type="dxa" w:w="3120"/>
+            <w:tcMar>
+              <w:top w:type="dxa" w:w="80"/>
+              <w:left w:type="dxa" w:w="120"/>
+              <w:bottom w:type="dxa" w:w="80"/>
+              <w:right w:type="dxa" w:w="120"/>
+            </w:tcMar>
+          </w:tcPr>
+          <w:p>
+            <w:r>
+              <w:rPr>
+                <w:rFonts w:ascii="Arial" w:hAnsi="Arial"/>
+                <w:sz w:val="22"/>
+              </w:rPr>
+              <w:t>Single format with 3 AI suggestions per state</w:t>
+            </w:r>
+          </w:p>
+        </w:tc>
+        <w:tc>
+          <w:tcPr>
+            <w:tcW w:type="dxa" w:w="3120"/>
+            <w:tcMar>
+              <w:top w:type="dxa" w:w="80"/>
+              <w:left w:type="dxa" w:w="120"/>
+              <w:bottom w:type="dxa" w:w="80"/>
+              <w:right w:type="dxa" w:w="120"/>
+            </w:tcMar>
+          </w:tcPr>
+          <w:p>
+            <w:r>
+              <w:rPr>
+                <w:rFonts w:ascii="Arial" w:hAnsi="Arial"/>
+                <w:sz w:val="22"/>
+              </w:rPr>
+              <w:t>15</w:t>
+            </w:r>
+          </w:p>
+        </w:tc>
+        <w:tc>
+          <w:tcPr>
+            <w:tcW w:type="dxa" w:w="3120"/>
+            <w:tcMar>
+              <w:top w:type="dxa" w:w="80"/>
+              <w:left w:type="dxa" w:w="120"/>
+              <w:bottom w:type="dxa" w:w="80"/>
+              <w:right w:type="dxa" w:w="120"/>
+            </w:tcMar>
+          </w:tcPr>
+          <w:p>
+            <w:r>
+              <w:rPr>
+                <w:rFonts w:ascii="Arial" w:hAnsi="Arial"/>
+                <w:sz w:val="22"/>
+              </w:rPr>
+              <w:t>$0.30 - $0.75</w:t>
+            </w:r>
+          </w:p>
+        </w:tc>
+      </w:tr>
+      <w:tr>
+        <w:tc>
+          <w:tcPr>
+            <w:tcW w:type="dxa" w:w="3120"/>
+            <w:tcMar>
+              <w:top w:type="dxa" w:w="80"/>
+              <w:left w:type="dxa" w:w="120"/>
+              <w:bottom w:type="dxa" w:w="80"/>
+              <w:right w:type="dxa" w:w="120"/>
+            </w:tcMar>
+          </w:tcPr>
+          <w:p>
+            <w:r>
+              <w:rPr>
+                <w:rFonts w:ascii="Arial" w:hAnsi="Arial"/>
+                <w:sz w:val="22"/>
+              </w:rPr>
+              <w:t>3 formats, all 5 states each</w:t>
+            </w:r>
+          </w:p>
+        </w:tc>
+        <w:tc>
+          <w:tcPr>
+            <w:tcW w:type="dxa" w:w="3120"/>
+            <w:tcMar>
+              <w:top w:type="dxa" w:w="80"/>
+              <w:left w:type="dxa" w:w="120"/>
+              <w:bottom w:type="dxa" w:w="80"/>
+              <w:right w:type="dxa" w:w="120"/>
+            </w:tcMar>
+          </w:tcPr>
+          <w:p>
+            <w:r>
+              <w:rPr>
+                <w:rFonts w:ascii="Arial" w:hAnsi="Arial"/>
+                <w:sz w:val="22"/>
+              </w:rPr>
+              <w:t>15</w:t>
+            </w:r>
+          </w:p>
+        </w:tc>
+        <w:tc>
+          <w:tcPr>
+            <w:tcW w:type="dxa" w:w="3120"/>
+            <w:tcMar>
+              <w:top w:type="dxa" w:w="80"/>
+              <w:left w:type="dxa" w:w="120"/>
+              <w:bottom w:type="dxa" w:w="80"/>
+              <w:right w:type="dxa" w:w="120"/>
+            </w:tcMar>
+          </w:tcPr>
+          <w:p>
+            <w:r>
+              <w:rPr>
+                <w:rFonts w:ascii="Arial" w:hAnsi="Arial"/>
+                <w:sz w:val="22"/>
+              </w:rPr>
+              <w:t>$0.30 - $0.75</w:t>
+            </w:r>
+          </w:p>
+        </w:tc>
+      </w:tr>
+      <w:tr>
+        <w:tc>
+          <w:tcPr>
+            <w:tcW w:type="dxa" w:w="3120"/>
+            <w:tcMar>
+              <w:top w:type="dxa" w:w="80"/>
+              <w:left w:type="dxa" w:w="120"/>
+              <w:bottom w:type="dxa" w:w="80"/>
+              <w:right w:type="dxa" w:w="120"/>
+            </w:tcMar>
+          </w:tcPr>
+          <w:p>
+            <w:r>
+              <w:rPr>
+                <w:rFonts w:ascii="Arial" w:hAnsi="Arial"/>
+                <w:sz w:val="22"/>
+              </w:rPr>
+              <w:t>Full campaign: 3 formats x 5 states x 5 variations</w:t>
+            </w:r>
+          </w:p>
+        </w:tc>
+        <w:tc>
+          <w:tcPr>
+            <w:tcW w:type="dxa" w:w="3120"/>
+            <w:tcMar>
+              <w:top w:type="dxa" w:w="80"/>
+              <w:left w:type="dxa" w:w="120"/>
+              <w:bottom w:type="dxa" w:w="80"/>
+              <w:right w:type="dxa" w:w="120"/>
+            </w:tcMar>
+          </w:tcPr>
+          <w:p>
+            <w:r>
+              <w:rPr>
+                <w:rFonts w:ascii="Arial" w:hAnsi="Arial"/>
+                <w:sz w:val="22"/>
+              </w:rPr>
+              <w:t>75</w:t>
+            </w:r>
+          </w:p>
+        </w:tc>
+        <w:tc>
+          <w:tcPr>
+            <w:tcW w:type="dxa" w:w="3120"/>
+            <w:tcMar>
+              <w:top w:type="dxa" w:w="80"/>
+              <w:left w:type="dxa" w:w="120"/>
+              <w:bottom w:type="dxa" w:w="80"/>
+              <w:right w:type="dxa" w:w="120"/>
+            </w:tcMar>
+          </w:tcPr>
+          <w:p>
+            <w:r>
+              <w:rPr>
+                <w:rFonts w:ascii="Arial" w:hAnsi="Arial"/>
+                <w:sz w:val="22"/>
+              </w:rPr>
+              <w:t>$1.50 - $3.75</w:t>
+            </w:r>
+          </w:p>
+        </w:tc>
+      </w:tr>
+      <w:tr>
+        <w:tc>
+          <w:tcPr>
+            <w:tcW w:type="dxa" w:w="3120"/>
+            <w:tcMar>
+              <w:top w:type="dxa" w:w="80"/>
+              <w:left w:type="dxa" w:w="120"/>
+              <w:bottom w:type="dxa" w:w="80"/>
+              <w:right w:type="dxa" w:w="120"/>
+            </w:tcMar>
+          </w:tcPr>
+          <w:p>
+            <w:r>
+              <w:rPr>
+                <w:rFonts w:ascii="Arial" w:hAnsi="Arial"/>
+                <w:sz w:val="22"/>
+              </w:rPr>
+              <w:t xml:space="preserve">With ~10% retry overhead</w:t>
+            </w:r>
+          </w:p>
+        </w:tc>
+        <w:tc>
+          <w:tcPr>
+            <w:tcW w:type="dxa" w:w="3120"/>
+            <w:tcMar>
+              <w:top w:type="dxa" w:w="80"/>
+              <w:left w:type="dxa" w:w="120"/>
+              <w:bottom w:type="dxa" w:w="80"/>
+              <w:right w:type="dxa" w:w="120"/>
+            </w:tcMar>
+          </w:tcPr>
+          <w:p>
+            <w:r>
+              <w:rPr>
+                <w:rFonts w:ascii="Arial" w:hAnsi="Arial"/>
+                <w:sz w:val="22"/>
+              </w:rPr>
+              <w:t>~83</w:t>
+            </w:r>
+          </w:p>
+        </w:tc>
+        <w:tc>
+          <w:tcPr>
+            <w:tcW w:type="dxa" w:w="3120"/>
+            <w:tcMar>
+              <w:top w:type="dxa" w:w="80"/>
+              <w:left w:type="dxa" w:w="120"/>
+              <w:bottom w:type="dxa" w:w="80"/>
+              <w:right w:type="dxa" w:w="120"/>
+            </w:tcMar>
+          </w:tcPr>
+          <w:p>
+            <w:r>
+              <w:rPr>
+                <w:rFonts w:ascii="Arial" w:hAnsi="Arial"/>
+                <w:sz w:val="22"/>
+              </w:rPr>
+              <w:t>$1.66 - $4.15</w:t>
+            </w:r>
+          </w:p>
+        </w:tc>
+      </w:tr>
+    </w:tbl>
+    <w:p>
+      <w:pPr>
+        <w:spacing w:after="120" w:before="180"/>
+      </w:pPr>
+      <w:r>
+        <w:rPr>
+          <w:rFonts w:ascii="Arial" w:cs="Arial" w:eastAsia="Arial" w:hAnsi="Arial"/>
+          <w:sz w:val="22"/>
+          <w:szCs w:val="22"/>
+        </w:rPr>
+        <w:t xml:space="preserve">These costs are borne by SkratchAds (server-side API calls), not the end user. The retry logic in the API route adds approximately 10% overhead due to occasional rate limits and transient failures. Costs scale linearly with the number of formats and variations selected.</w:t>
+      </w:r>
+    </w:p>
+    <w:p>
+      <w:pPr>
+        <w:spacing w:after="120" w:before="60"/>
+      </w:pPr>
+      <w:r>
+        <w:rPr>
+          <w:rFonts w:ascii="Arial" w:cs="Arial" w:eastAsia="Arial" w:hAnsi="Arial"/>
+          <w:b/>
+          <w:bCs/>
+          <w:sz w:val="22"/>
+          <w:szCs w:val="22"/>
+        </w:rPr>
+        <w:t xml:space="preserve">Future consideration: </w:t>
+      </w:r>
+      <w:r>
+        <w:rPr>
+          <w:rFonts w:ascii="Arial" w:cs="Arial" w:eastAsia="Arial" w:hAnsi="Arial"/>
+          <w:sz w:val="22"/>
+          <w:szCs w:val="22"/>
+        </w:rPr>
+        <w:t xml:space="preserve">Display an estimated cost to the user before generation starts, especially for large batch operations (multiple formats x multiple variations). This enables informed decision-making and prevents unexpected API spend.</w:t>
       </w:r>
     </w:p>
     <w:p>

</xml_diff>